<commit_message>
feat(cv): update ATS CV with Gadai Enoni Cell (Midtrans) and optimize to 1 page
</commit_message>
<xml_diff>
--- a/public/cv/Reyon-Lau-Jiemin-CV.docx
+++ b/public/cv/Reyon-Lau-Jiemin-CV.docx
@@ -68,7 +68,7 @@
     </w:p>
     <w:p>
       <w:pPr>
-        <w:spacing w:before="180" w:after="40"/>
+        <w:spacing w:before="120" w:after="40"/>
         <w:pBdr>
           <w:bottom w:val="single" w:sz="6" w:space="1" w:color="B9C2CC"/>
         </w:pBdr>
@@ -94,14 +94,14 @@
           <w:b w:val="0"/>
           <w:i w:val="0"/>
           <w:color w:val="1F2A37"/>
-          <w:sz w:val="21"/>
+          <w:sz w:val="20"/>
         </w:rPr>
         <w:t>Lulusan S1 Teknik Informatika (IPK 3,56) dengan fokus pengembangan backend Laravel/PHP. Terbiasa membangun sistem produksi end-to-end: merancang REST API yang dipakai dua klien sekaligus (web dan Android), memodelkan database relasional, menulis pengujian otomatis, serta men-deploy dan men-debug langsung di server produksi. Terbiasa bekerja dengan alur AI-assisted coding namun tetap membaca dan menguji setiap perubahan.</w:t>
       </w:r>
     </w:p>
     <w:p>
       <w:pPr>
-        <w:spacing w:before="180" w:after="40"/>
+        <w:spacing w:before="120" w:after="40"/>
         <w:pBdr>
           <w:bottom w:val="single" w:sz="6" w:space="1" w:color="B9C2CC"/>
         </w:pBdr>
@@ -127,7 +127,7 @@
           <w:b/>
           <w:i w:val="0"/>
           <w:color w:val="1F2A37"/>
-          <w:sz w:val="21"/>
+          <w:sz w:val="20"/>
         </w:rPr>
         <w:t>Backend</w:t>
       </w:r>
@@ -137,9 +137,9 @@
           <w:b w:val="0"/>
           <w:i w:val="0"/>
           <w:color w:val="1F2A37"/>
-          <w:sz w:val="21"/>
+          <w:sz w:val="20"/>
         </w:rPr>
-        <w:t>: PHP 8.3, Laravel, Livewire, REST API, MySQL, Composer, autentikasi &amp; validasi request</w:t>
+        <w:t>: PHP 8.3, Laravel, Livewire, REST API, MySQL, Composer, Midtrans Payment Gateway (Snap API), autentikasi &amp; validasi request</w:t>
       </w:r>
     </w:p>
     <w:p>
@@ -152,7 +152,7 @@
           <w:b/>
           <w:i w:val="0"/>
           <w:color w:val="1F2A37"/>
-          <w:sz w:val="21"/>
+          <w:sz w:val="20"/>
         </w:rPr>
         <w:t>Frontend</w:t>
       </w:r>
@@ -162,7 +162,7 @@
           <w:b w:val="0"/>
           <w:i w:val="0"/>
           <w:color w:val="1F2A37"/>
-          <w:sz w:val="21"/>
+          <w:sz w:val="20"/>
         </w:rPr>
         <w:t>: React, JavaScript, TypeScript, Tailwind CSS, Next.js, Blade</w:t>
       </w:r>
@@ -177,7 +177,7 @@
           <w:b/>
           <w:i w:val="0"/>
           <w:color w:val="1F2A37"/>
-          <w:sz w:val="21"/>
+          <w:sz w:val="20"/>
         </w:rPr>
         <w:t>Mobile &amp; Alat</w:t>
       </w:r>
@@ -187,7 +187,7 @@
           <w:b w:val="0"/>
           <w:i w:val="0"/>
           <w:color w:val="1F2A37"/>
-          <w:sz w:val="21"/>
+          <w:sz w:val="20"/>
         </w:rPr>
         <w:t>: Flutter, Dio, Bluetooth thermal printer, Git, GitHub Actions (CI/CD), Docker (dasar), Postman, Linux/Windows CLI</w:t>
       </w:r>
@@ -202,7 +202,7 @@
           <w:b/>
           <w:i w:val="0"/>
           <w:color w:val="1F2A37"/>
-          <w:sz w:val="21"/>
+          <w:sz w:val="20"/>
         </w:rPr>
         <w:t>Konsep</w:t>
       </w:r>
@@ -212,14 +212,14 @@
           <w:b w:val="0"/>
           <w:i w:val="0"/>
           <w:color w:val="1F2A37"/>
-          <w:sz w:val="21"/>
+          <w:sz w:val="20"/>
         </w:rPr>
         <w:t>: MVC, desain database relasional, pengujian otomatis (PHPUnit/Pest, flutter_test, Vitest), debugging produksi, Git workflow</w:t>
       </w:r>
     </w:p>
     <w:p>
       <w:pPr>
-        <w:spacing w:before="180" w:after="40"/>
+        <w:spacing w:before="120" w:after="40"/>
         <w:pBdr>
           <w:bottom w:val="single" w:sz="6" w:space="1" w:color="B9C2CC"/>
         </w:pBdr>
@@ -237,7 +237,7 @@
     </w:p>
     <w:p>
       <w:pPr>
-        <w:spacing w:before="80" w:after="0"/>
+        <w:spacing w:before="60" w:after="0"/>
       </w:pPr>
       <w:r>
         <w:rPr>
@@ -245,7 +245,7 @@
           <w:b/>
           <w:i w:val="0"/>
           <w:color w:val="1F2A37"/>
-          <w:sz w:val="21"/>
+          <w:sz w:val="20"/>
         </w:rPr>
         <w:t>Warung Lupi — Sistem Kasir &amp; Pembukuan (Web + Android)</w:t>
       </w:r>
@@ -255,7 +255,7 @@
           <w:b w:val="0"/>
           <w:i w:val="0"/>
           <w:color w:val="444C56"/>
-          <w:sz w:val="21"/>
+          <w:sz w:val="20"/>
         </w:rPr>
         <w:t xml:space="preserve">  |  2025 – 2026</w:t>
       </w:r>
@@ -270,7 +270,7 @@
           <w:b w:val="0"/>
           <w:i/>
           <w:color w:val="444C56"/>
-          <w:sz w:val="19"/>
+          <w:sz w:val="18"/>
         </w:rPr>
         <w:t>Laravel, PHP 8.3, MySQL, React, Flutter, REST API</w:t>
       </w:r>
@@ -286,7 +286,7 @@
           <w:rFonts w:ascii="Calibri" w:hAnsi="Calibri"/>
           <w:b w:val="0"/>
           <w:color w:val="1F2A37"/>
-          <w:sz w:val="21"/>
+          <w:sz w:val="20"/>
         </w:rPr>
         <w:t xml:space="preserve">Merancang dan membangun </w:t>
       </w:r>
@@ -295,7 +295,7 @@
           <w:rFonts w:ascii="Calibri" w:hAnsi="Calibri"/>
           <w:b/>
           <w:color w:val="1F2A37"/>
-          <w:sz w:val="21"/>
+          <w:sz w:val="20"/>
         </w:rPr>
         <w:t>REST API Laravel</w:t>
       </w:r>
@@ -304,7 +304,7 @@
           <w:rFonts w:ascii="Calibri" w:hAnsi="Calibri"/>
           <w:b w:val="0"/>
           <w:color w:val="1F2A37"/>
-          <w:sz w:val="21"/>
+          <w:sz w:val="20"/>
         </w:rPr>
         <w:t xml:space="preserve"> sebagai satu sumber data untuk dua klien: aplikasi web dan aplikasi Android.</w:t>
       </w:r>
@@ -320,7 +320,7 @@
           <w:rFonts w:ascii="Calibri" w:hAnsi="Calibri"/>
           <w:b w:val="0"/>
           <w:color w:val="1F2A37"/>
-          <w:sz w:val="21"/>
+          <w:sz w:val="20"/>
         </w:rPr>
         <w:t xml:space="preserve">Mengembangkan modul </w:t>
       </w:r>
@@ -329,7 +329,7 @@
           <w:rFonts w:ascii="Calibri" w:hAnsi="Calibri"/>
           <w:b/>
           <w:color w:val="1F2A37"/>
-          <w:sz w:val="21"/>
+          <w:sz w:val="20"/>
         </w:rPr>
         <w:t>bon/lunas/hutang</w:t>
       </w:r>
@@ -338,9 +338,27 @@
           <w:rFonts w:ascii="Calibri" w:hAnsi="Calibri"/>
           <w:b w:val="0"/>
           <w:color w:val="1F2A37"/>
-          <w:sz w:val="21"/>
+          <w:sz w:val="20"/>
         </w:rPr>
-        <w:t>, aturan promo otomatis, dan laporan penjualan per item (termasuk laporan rokok).</w:t>
+        <w:t xml:space="preserve">, aturan promo otomatis, dan laporan penjualan per item; menerapkan </w:t>
+      </w:r>
+      <w:r>
+        <w:rPr>
+          <w:rFonts w:ascii="Calibri" w:hAnsi="Calibri"/>
+          <w:b/>
+          <w:color w:val="1F2A37"/>
+          <w:sz w:val="20"/>
+        </w:rPr>
+        <w:t>pengujian otomatis dan CI/CD</w:t>
+      </w:r>
+      <w:r>
+        <w:rPr>
+          <w:rFonts w:ascii="Calibri" w:hAnsi="Calibri"/>
+          <w:b w:val="0"/>
+          <w:color w:val="1F2A37"/>
+          <w:sz w:val="20"/>
+        </w:rPr>
+        <w:t>, dipakai harian di domain produksi.</w:t>
       </w:r>
     </w:p>
     <w:p>
@@ -354,27 +372,67 @@
           <w:rFonts w:ascii="Calibri" w:hAnsi="Calibri"/>
           <w:b w:val="0"/>
           <w:color w:val="1F2A37"/>
-          <w:sz w:val="21"/>
+          <w:sz w:val="20"/>
         </w:rPr>
-        <w:t xml:space="preserve">Menerapkan </w:t>
+        <w:t xml:space="preserve">Mendiagnosis gangguan server produksi (koneksi database &amp; rate limit shared hosting) dan menambah mekanisme </w:t>
       </w:r>
       <w:r>
         <w:rPr>
           <w:rFonts w:ascii="Calibri" w:hAnsi="Calibri"/>
           <w:b/>
           <w:color w:val="1F2A37"/>
-          <w:sz w:val="21"/>
+          <w:sz w:val="20"/>
         </w:rPr>
-        <w:t>pengujian otomatis dan CI/CD</w:t>
+        <w:t>retry dengan backoff</w:t>
       </w:r>
       <w:r>
         <w:rPr>
           <w:rFonts w:ascii="Calibri" w:hAnsi="Calibri"/>
           <w:b w:val="0"/>
           <w:color w:val="1F2A37"/>
-          <w:sz w:val="21"/>
+          <w:sz w:val="20"/>
         </w:rPr>
-        <w:t>; sistem berjalan di domain produksi dan dipakai harian oleh warung nyata.</w:t>
+        <w:t xml:space="preserve"> di sisi klien.</w:t>
+      </w:r>
+    </w:p>
+    <w:p>
+      <w:pPr>
+        <w:spacing w:before="60" w:after="0"/>
+      </w:pPr>
+      <w:r>
+        <w:rPr>
+          <w:rFonts w:ascii="Calibri" w:hAnsi="Calibri"/>
+          <w:b/>
+          <w:i w:val="0"/>
+          <w:color w:val="1F2A37"/>
+          <w:sz w:val="20"/>
+        </w:rPr>
+        <w:t>Gadai Enoni Cell — Sistem Manajemen Pegadaian (tim 2 orang)</w:t>
+      </w:r>
+      <w:r>
+        <w:rPr>
+          <w:rFonts w:ascii="Calibri" w:hAnsi="Calibri"/>
+          <w:b w:val="0"/>
+          <w:i w:val="0"/>
+          <w:color w:val="444C56"/>
+          <w:sz w:val="20"/>
+        </w:rPr>
+        <w:t xml:space="preserve">  |  2025</w:t>
+      </w:r>
+    </w:p>
+    <w:p>
+      <w:pPr>
+        <w:spacing w:before="0" w:after="20"/>
+      </w:pPr>
+      <w:r>
+        <w:rPr>
+          <w:rFonts w:ascii="Calibri" w:hAnsi="Calibri"/>
+          <w:b w:val="0"/>
+          <w:i/>
+          <w:color w:val="444C56"/>
+          <w:sz w:val="18"/>
+        </w:rPr>
+        <w:t>Laravel, PHP 8.2, MySQL, Midtrans Snap</w:t>
       </w:r>
     </w:p>
     <w:p>
@@ -388,32 +446,136 @@
           <w:rFonts w:ascii="Calibri" w:hAnsi="Calibri"/>
           <w:b w:val="0"/>
           <w:color w:val="1F2A37"/>
-          <w:sz w:val="21"/>
+          <w:sz w:val="20"/>
         </w:rPr>
-        <w:t xml:space="preserve">Mendiagnosis gangguan server produksi (koneksi database &amp; rate limit shared hosting) dan menambah mekanisme </w:t>
+        <w:t xml:space="preserve">Mengintegrasikan </w:t>
       </w:r>
       <w:r>
         <w:rPr>
           <w:rFonts w:ascii="Calibri" w:hAnsi="Calibri"/>
           <w:b/>
           <w:color w:val="1F2A37"/>
-          <w:sz w:val="21"/>
+          <w:sz w:val="20"/>
         </w:rPr>
-        <w:t>retry dengan backoff</w:t>
+        <w:t>payment gateway Midtrans Snap</w:t>
       </w:r>
       <w:r>
         <w:rPr>
           <w:rFonts w:ascii="Calibri" w:hAnsi="Calibri"/>
           <w:b w:val="0"/>
           <w:color w:val="1F2A37"/>
-          <w:sz w:val="21"/>
+          <w:sz w:val="20"/>
         </w:rPr>
-        <w:t xml:space="preserve"> di sisi klien.</w:t>
+        <w:t xml:space="preserve"> untuk pembayaran tebus &amp; perpanjang gadai: create/resume/reprocess/cancel, generate Snap token, dan </w:t>
+      </w:r>
+      <w:r>
+        <w:rPr>
+          <w:rFonts w:ascii="Calibri" w:hAnsi="Calibri"/>
+          <w:b/>
+          <w:color w:val="1F2A37"/>
+          <w:sz w:val="20"/>
+        </w:rPr>
+        <w:t>handler notifikasi webhook</w:t>
+      </w:r>
+      <w:r>
+        <w:rPr>
+          <w:rFonts w:ascii="Calibri" w:hAnsi="Calibri"/>
+          <w:b w:val="0"/>
+          <w:color w:val="1F2A37"/>
+          <w:sz w:val="20"/>
+        </w:rPr>
+        <w:t xml:space="preserve"> sinkronisasi status transaksi (sandbox).</w:t>
       </w:r>
     </w:p>
     <w:p>
       <w:pPr>
-        <w:spacing w:before="80" w:after="0"/>
+        <w:pStyle w:val="ListBullet"/>
+        <w:spacing w:before="0" w:after="0"/>
+        <w:ind w:left="283" w:hanging="181"/>
+      </w:pPr>
+      <w:r>
+        <w:rPr>
+          <w:rFonts w:ascii="Calibri" w:hAnsi="Calibri"/>
+          <w:b w:val="0"/>
+          <w:color w:val="1F2A37"/>
+          <w:sz w:val="20"/>
+        </w:rPr>
+        <w:t xml:space="preserve">Membangun </w:t>
+      </w:r>
+      <w:r>
+        <w:rPr>
+          <w:rFonts w:ascii="Calibri" w:hAnsi="Calibri"/>
+          <w:b/>
+          <w:color w:val="1F2A37"/>
+          <w:sz w:val="20"/>
+        </w:rPr>
+        <w:t>backend alur bisnis pegadaian</w:t>
+      </w:r>
+      <w:r>
+        <w:rPr>
+          <w:rFonts w:ascii="Calibri" w:hAnsi="Calibri"/>
+          <w:b w:val="0"/>
+          <w:color w:val="1F2A37"/>
+          <w:sz w:val="20"/>
+        </w:rPr>
+        <w:t xml:space="preserve">: tebus, perpanjang, lelang, penaksiran harga, bunga tenor, saldo cabang, transaksi multi-cabang — Eloquent + </w:t>
+      </w:r>
+      <w:r>
+        <w:rPr>
+          <w:rFonts w:ascii="Calibri" w:hAnsi="Calibri"/>
+          <w:b/>
+          <w:color w:val="1F2A37"/>
+          <w:sz w:val="20"/>
+        </w:rPr>
+        <w:t>29 migration</w:t>
+      </w:r>
+      <w:r>
+        <w:rPr>
+          <w:rFonts w:ascii="Calibri" w:hAnsi="Calibri"/>
+          <w:b w:val="0"/>
+          <w:color w:val="1F2A37"/>
+          <w:sz w:val="20"/>
+        </w:rPr>
+        <w:t>, multi-role (superadmin/admin/staff/nasabah).</w:t>
+      </w:r>
+    </w:p>
+    <w:p>
+      <w:pPr>
+        <w:pStyle w:val="ListBullet"/>
+        <w:spacing w:before="0" w:after="0"/>
+        <w:ind w:left="283" w:hanging="181"/>
+      </w:pPr>
+      <w:r>
+        <w:rPr>
+          <w:rFonts w:ascii="Calibri" w:hAnsi="Calibri"/>
+          <w:b w:val="0"/>
+          <w:color w:val="1F2A37"/>
+          <w:sz w:val="20"/>
+        </w:rPr>
+        <w:t xml:space="preserve">Menjaga integritas transaksi: cegah pembayaran ganda &amp; tebus barang berstatus ditebus, mekanisme state </w:t>
+      </w:r>
+      <w:r>
+        <w:rPr>
+          <w:rFonts w:ascii="Calibri" w:hAnsi="Calibri"/>
+          <w:b/>
+          <w:color w:val="1F2A37"/>
+          <w:sz w:val="20"/>
+        </w:rPr>
+        <w:t>pending payment</w:t>
+      </w:r>
+      <w:r>
+        <w:rPr>
+          <w:rFonts w:ascii="Calibri" w:hAnsi="Calibri"/>
+          <w:b w:val="0"/>
+          <w:color w:val="1F2A37"/>
+          <w:sz w:val="20"/>
+        </w:rPr>
+        <w:t xml:space="preserve"> beserta resume/reprocess; konfigurasi server/client key via .env, 3DS.</w:t>
+      </w:r>
+    </w:p>
+    <w:p>
+      <w:pPr>
+        <w:spacing w:before="60" w:after="0"/>
       </w:pPr>
       <w:r>
         <w:rPr>
@@ -421,7 +583,7 @@
           <w:b/>
           <w:i w:val="0"/>
           <w:color w:val="1F2A37"/>
-          <w:sz w:val="21"/>
+          <w:sz w:val="20"/>
         </w:rPr>
         <w:t>DAILY.CO — Sistem Pemesanan Sablon (Skripsi)</w:t>
       </w:r>
@@ -431,7 +593,7 @@
           <w:b w:val="0"/>
           <w:i w:val="0"/>
           <w:color w:val="444C56"/>
-          <w:sz w:val="21"/>
+          <w:sz w:val="20"/>
         </w:rPr>
         <w:t xml:space="preserve">  |  2025 – 2026</w:t>
       </w:r>
@@ -446,7 +608,7 @@
           <w:b w:val="0"/>
           <w:i/>
           <w:color w:val="444C56"/>
-          <w:sz w:val="19"/>
+          <w:sz w:val="18"/>
         </w:rPr>
         <w:t>Laravel, Livewire, Fabric.js, Tailwind CSS, MySQL</w:t>
       </w:r>
@@ -462,7 +624,7 @@
           <w:rFonts w:ascii="Calibri" w:hAnsi="Calibri"/>
           <w:b w:val="0"/>
           <w:color w:val="1F2A37"/>
-          <w:sz w:val="21"/>
+          <w:sz w:val="20"/>
         </w:rPr>
         <w:t xml:space="preserve">Membangun </w:t>
       </w:r>
@@ -471,7 +633,7 @@
           <w:rFonts w:ascii="Calibri" w:hAnsi="Calibri"/>
           <w:b/>
           <w:color w:val="1F2A37"/>
-          <w:sz w:val="21"/>
+          <w:sz w:val="20"/>
         </w:rPr>
         <w:t>editor desain kanvas multi-zona</w:t>
       </w:r>
@@ -480,9 +642,9 @@
           <w:rFonts w:ascii="Calibri" w:hAnsi="Calibri"/>
           <w:b w:val="0"/>
           <w:color w:val="1F2A37"/>
-          <w:sz w:val="21"/>
+          <w:sz w:val="20"/>
         </w:rPr>
-        <w:t xml:space="preserve"> (Fabric.js) yang mengubah desain sablon menjadi pesanan tanpa komunikasi bolak-balik.</w:t>
+        <w:t xml:space="preserve"> (Fabric.js) yang mengubah desain sablon menjadi pesanan tanpa komunikasi bolak-balik; alur order dengan verifikasi admin.</w:t>
       </w:r>
     </w:p>
     <w:p>
@@ -496,23 +658,7 @@
           <w:rFonts w:ascii="Calibri" w:hAnsi="Calibri"/>
           <w:b w:val="0"/>
           <w:color w:val="1F2A37"/>
-          <w:sz w:val="21"/>
-        </w:rPr>
-        <w:t>Merancang alur order dengan verifikasi admin, penyimpanan status desain, dan relasi database untuk pesanan multi-item.</w:t>
-      </w:r>
-    </w:p>
-    <w:p>
-      <w:pPr>
-        <w:pStyle w:val="ListBullet"/>
-        <w:spacing w:before="0" w:after="0"/>
-        <w:ind w:left="283" w:hanging="181"/>
-      </w:pPr>
-      <w:r>
-        <w:rPr>
-          <w:rFonts w:ascii="Calibri" w:hAnsi="Calibri"/>
-          <w:b w:val="0"/>
-          <w:color w:val="1F2A37"/>
-          <w:sz w:val="21"/>
+          <w:sz w:val="20"/>
         </w:rPr>
         <w:t xml:space="preserve">Menulis </w:t>
       </w:r>
@@ -521,7 +667,7 @@
           <w:rFonts w:ascii="Calibri" w:hAnsi="Calibri"/>
           <w:b/>
           <w:color w:val="1F2A37"/>
-          <w:sz w:val="21"/>
+          <w:sz w:val="20"/>
         </w:rPr>
         <w:t>46 test (11 file)</w:t>
       </w:r>
@@ -530,14 +676,14 @@
           <w:rFonts w:ascii="Calibri" w:hAnsi="Calibri"/>
           <w:b w:val="0"/>
           <w:color w:val="1F2A37"/>
-          <w:sz w:val="21"/>
+          <w:sz w:val="20"/>
         </w:rPr>
         <w:t xml:space="preserve"> yang berjalan otomatis di CI terhadap MySQL.</w:t>
       </w:r>
     </w:p>
     <w:p>
       <w:pPr>
-        <w:spacing w:before="80" w:after="0"/>
+        <w:spacing w:before="60" w:after="0"/>
       </w:pPr>
       <w:r>
         <w:rPr>
@@ -545,7 +691,7 @@
           <w:b/>
           <w:i w:val="0"/>
           <w:color w:val="1F2A37"/>
-          <w:sz w:val="21"/>
+          <w:sz w:val="20"/>
         </w:rPr>
         <w:t>Hermes DevOps — CLI Otomasi Build, Test &amp; Release (repo privat)</w:t>
       </w:r>
@@ -555,7 +701,7 @@
           <w:b w:val="0"/>
           <w:i w:val="0"/>
           <w:color w:val="444C56"/>
-          <w:sz w:val="21"/>
+          <w:sz w:val="20"/>
         </w:rPr>
         <w:t xml:space="preserve">  |  2026 – sekarang</w:t>
       </w:r>
@@ -570,7 +716,7 @@
           <w:b w:val="0"/>
           <w:i/>
           <w:color w:val="444C56"/>
-          <w:sz w:val="19"/>
+          <w:sz w:val="18"/>
         </w:rPr>
         <w:t>TypeScript, Node.js, Git, GitHub Actions</w:t>
       </w:r>
@@ -586,16 +732,16 @@
           <w:rFonts w:ascii="Calibri" w:hAnsi="Calibri"/>
           <w:b w:val="0"/>
           <w:color w:val="1F2A37"/>
-          <w:sz w:val="21"/>
+          <w:sz w:val="20"/>
         </w:rPr>
-        <w:t xml:space="preserve">Membangun CLI yang mendeteksi stack proyek, menjalankan build/test/release di balik gerbang keamanan </w:t>
+        <w:t xml:space="preserve">Membangun CLI yang mendeteksi stack proyek, menjalankan build/test/release di balik gerbang </w:t>
       </w:r>
       <w:r>
         <w:rPr>
           <w:rFonts w:ascii="Calibri" w:hAnsi="Calibri"/>
           <w:b/>
           <w:color w:val="1F2A37"/>
-          <w:sz w:val="21"/>
+          <w:sz w:val="20"/>
         </w:rPr>
         <w:t>SAFE/REVIEW/DANGEROUS</w:t>
       </w:r>
@@ -604,7 +750,7 @@
           <w:rFonts w:ascii="Calibri" w:hAnsi="Calibri"/>
           <w:b w:val="0"/>
           <w:color w:val="1F2A37"/>
-          <w:sz w:val="21"/>
+          <w:sz w:val="20"/>
         </w:rPr>
         <w:t>, dan menolak melaporkan sukses tanpa bukti.</w:t>
       </w:r>
@@ -620,7 +766,7 @@
           <w:rFonts w:ascii="Calibri" w:hAnsi="Calibri"/>
           <w:b w:val="0"/>
           <w:color w:val="1F2A37"/>
-          <w:sz w:val="21"/>
+          <w:sz w:val="20"/>
         </w:rPr>
         <w:t xml:space="preserve">Menulis </w:t>
       </w:r>
@@ -629,7 +775,7 @@
           <w:rFonts w:ascii="Calibri" w:hAnsi="Calibri"/>
           <w:b/>
           <w:color w:val="1F2A37"/>
-          <w:sz w:val="21"/>
+          <w:sz w:val="20"/>
         </w:rPr>
         <w:t>198 test otomatis</w:t>
       </w:r>
@@ -638,14 +784,14 @@
           <w:rFonts w:ascii="Calibri" w:hAnsi="Calibri"/>
           <w:b w:val="0"/>
           <w:color w:val="1F2A37"/>
-          <w:sz w:val="21"/>
+          <w:sz w:val="20"/>
         </w:rPr>
-        <w:t xml:space="preserve"> dengan arsitektur append-only audit trail; dirilis hingga v0.7.5.</w:t>
+        <w:t xml:space="preserve"> dengan audit trail append-only; dirilis hingga v0.7.5.</w:t>
       </w:r>
     </w:p>
     <w:p>
       <w:pPr>
-        <w:spacing w:before="80" w:after="0"/>
+        <w:spacing w:before="60" w:after="0"/>
       </w:pPr>
       <w:r>
         <w:rPr>
@@ -653,7 +799,7 @@
           <w:b/>
           <w:i w:val="0"/>
           <w:color w:val="1F2A37"/>
-          <w:sz w:val="21"/>
+          <w:sz w:val="20"/>
         </w:rPr>
         <w:t>Website Portofolio Pribadi</w:t>
       </w:r>
@@ -663,7 +809,7 @@
           <w:b w:val="0"/>
           <w:i w:val="0"/>
           <w:color w:val="444C56"/>
-          <w:sz w:val="21"/>
+          <w:sz w:val="20"/>
         </w:rPr>
         <w:t xml:space="preserve">  |  2026</w:t>
       </w:r>
@@ -678,7 +824,7 @@
           <w:b w:val="0"/>
           <w:i/>
           <w:color w:val="444C56"/>
-          <w:sz w:val="19"/>
+          <w:sz w:val="18"/>
         </w:rPr>
         <w:t>Next.js, TypeScript, Tailwind CSS, Framer Motion</w:t>
       </w:r>
@@ -694,16 +840,16 @@
           <w:rFonts w:ascii="Calibri" w:hAnsi="Calibri"/>
           <w:b w:val="0"/>
           <w:color w:val="1F2A37"/>
-          <w:sz w:val="21"/>
+          <w:sz w:val="20"/>
         </w:rPr>
-        <w:t xml:space="preserve">Membangun dari nol; skor </w:t>
+        <w:t xml:space="preserve">Dibangun dari nol; skor </w:t>
       </w:r>
       <w:r>
         <w:rPr>
           <w:rFonts w:ascii="Calibri" w:hAnsi="Calibri"/>
           <w:b/>
           <w:color w:val="1F2A37"/>
-          <w:sz w:val="21"/>
+          <w:sz w:val="20"/>
         </w:rPr>
         <w:t>Lighthouse 100/100/100</w:t>
       </w:r>
@@ -712,30 +858,14 @@
           <w:rFonts w:ascii="Calibri" w:hAnsi="Calibri"/>
           <w:b w:val="0"/>
           <w:color w:val="1F2A37"/>
-          <w:sz w:val="21"/>
+          <w:sz w:val="20"/>
         </w:rPr>
-        <w:t xml:space="preserve"> pada desktop.</w:t>
+        <w:t xml:space="preserve"> desktop; setiap klaim proyek ditautkan ke repositori &amp; artefak yang dapat diverifikasi.</w:t>
       </w:r>
     </w:p>
     <w:p>
       <w:pPr>
-        <w:pStyle w:val="ListBullet"/>
-        <w:spacing w:before="0" w:after="0"/>
-        <w:ind w:left="283" w:hanging="181"/>
-      </w:pPr>
-      <w:r>
-        <w:rPr>
-          <w:rFonts w:ascii="Calibri" w:hAnsi="Calibri"/>
-          <w:b w:val="0"/>
-          <w:color w:val="1F2A37"/>
-          <w:sz w:val="21"/>
-        </w:rPr>
-        <w:t>Menautkan setiap klaim proyek ke repositori dan artefak yang dapat diverifikasi.</w:t>
-      </w:r>
-    </w:p>
-    <w:p>
-      <w:pPr>
-        <w:spacing w:before="180" w:after="40"/>
+        <w:spacing w:before="120" w:after="40"/>
         <w:pBdr>
           <w:bottom w:val="single" w:sz="6" w:space="1" w:color="B9C2CC"/>
         </w:pBdr>
@@ -761,7 +891,7 @@
           <w:b/>
           <w:i w:val="0"/>
           <w:color w:val="1F2A37"/>
-          <w:sz w:val="21"/>
+          <w:sz w:val="20"/>
         </w:rPr>
         <w:t>S1 Teknik Informatika — Universitas Pamulang</w:t>
       </w:r>
@@ -771,7 +901,7 @@
           <w:b w:val="0"/>
           <w:i w:val="0"/>
           <w:color w:val="444C56"/>
-          <w:sz w:val="21"/>
+          <w:sz w:val="20"/>
         </w:rPr>
         <w:t xml:space="preserve">  |  2022 – 2026  |  IPK 3,56 / 4,00</w:t>
       </w:r>
@@ -787,14 +917,14 @@
           <w:rFonts w:ascii="Calibri" w:hAnsi="Calibri"/>
           <w:b w:val="0"/>
           <w:color w:val="1F2A37"/>
-          <w:sz w:val="21"/>
+          <w:sz w:val="20"/>
         </w:rPr>
         <w:t>Skripsi: sistem pemesanan sablon berbasis web dengan editor desain kanvas (Laravel, Livewire, Fabric.js).</w:t>
       </w:r>
     </w:p>
     <w:sectPr>
       <w:pgSz w:w="12240" w:h="15840"/>
-      <w:pgMar w:top="850" w:right="964" w:bottom="794" w:left="964" w:header="720" w:footer="720" w:gutter="0"/>
+      <w:pgMar w:top="624" w:right="850" w:bottom="567" w:left="850" w:header="720" w:footer="720" w:gutter="0"/>
       <w:cols w:space="720"/>
       <w:docGrid w:linePitch="360"/>
     </w:sectPr>
@@ -1170,7 +1300,7 @@
     </w:pPr>
     <w:rPr>
       <w:rFonts w:ascii="Calibri" w:hAnsi="Calibri" w:eastAsia="Calibri"/>
-      <w:sz w:val="21"/>
+      <w:sz w:val="20"/>
     </w:rPr>
   </w:style>
   <w:style w:type="paragraph" w:styleId="Header">

</xml_diff>

<commit_message>
feat: add command palette, micro-simulations, dual CV selector, and live activity feeds
</commit_message>
<xml_diff>
--- a/public/cv/Reyon-Lau-Jiemin-CV.docx
+++ b/public/cv/Reyon-Lau-Jiemin-CV.docx
@@ -68,7 +68,7 @@
     </w:p>
     <w:p>
       <w:pPr>
-        <w:spacing w:before="120" w:after="40"/>
+        <w:spacing w:before="100" w:after="20"/>
         <w:pBdr>
           <w:bottom w:val="single" w:sz="6" w:space="1" w:color="B9C2CC"/>
         </w:pBdr>
@@ -79,7 +79,7 @@
           <w:b/>
           <w:i w:val="0"/>
           <w:color w:val="1F2A37"/>
-          <w:sz w:val="21"/>
+          <w:sz w:val="20"/>
         </w:rPr>
         <w:t>RINGKASAN</w:t>
       </w:r>
@@ -94,14 +94,14 @@
           <w:b w:val="0"/>
           <w:i w:val="0"/>
           <w:color w:val="1F2A37"/>
-          <w:sz w:val="20"/>
+          <w:sz w:val="19"/>
         </w:rPr>
         <w:t>Lulusan S1 Teknik Informatika (IPK 3,56) dengan fokus pengembangan backend Laravel/PHP. Terbiasa membangun sistem produksi end-to-end: merancang REST API yang dipakai dua klien sekaligus (web dan Android), memodelkan database relasional, menulis pengujian otomatis, serta men-deploy dan men-debug langsung di server produksi. Terbiasa bekerja dengan alur AI-assisted coding namun tetap membaca dan menguji setiap perubahan.</w:t>
       </w:r>
     </w:p>
     <w:p>
       <w:pPr>
-        <w:spacing w:before="120" w:after="40"/>
+        <w:spacing w:before="100" w:after="20"/>
         <w:pBdr>
           <w:bottom w:val="single" w:sz="6" w:space="1" w:color="B9C2CC"/>
         </w:pBdr>
@@ -112,7 +112,7 @@
           <w:b/>
           <w:i w:val="0"/>
           <w:color w:val="1F2A37"/>
-          <w:sz w:val="21"/>
+          <w:sz w:val="20"/>
         </w:rPr>
         <w:t>KEAHLIAN TEKNIS</w:t>
       </w:r>
@@ -127,7 +127,7 @@
           <w:b/>
           <w:i w:val="0"/>
           <w:color w:val="1F2A37"/>
-          <w:sz w:val="20"/>
+          <w:sz w:val="19"/>
         </w:rPr>
         <w:t>Backend</w:t>
       </w:r>
@@ -137,7 +137,7 @@
           <w:b w:val="0"/>
           <w:i w:val="0"/>
           <w:color w:val="1F2A37"/>
-          <w:sz w:val="20"/>
+          <w:sz w:val="19"/>
         </w:rPr>
         <w:t>: PHP 8.3, Laravel, Livewire, REST API, MySQL, Composer, Midtrans Payment Gateway (Snap API), autentikasi &amp; validasi request</w:t>
       </w:r>
@@ -152,7 +152,7 @@
           <w:b/>
           <w:i w:val="0"/>
           <w:color w:val="1F2A37"/>
-          <w:sz w:val="20"/>
+          <w:sz w:val="19"/>
         </w:rPr>
         <w:t>Frontend</w:t>
       </w:r>
@@ -162,7 +162,7 @@
           <w:b w:val="0"/>
           <w:i w:val="0"/>
           <w:color w:val="1F2A37"/>
-          <w:sz w:val="20"/>
+          <w:sz w:val="19"/>
         </w:rPr>
         <w:t>: React, JavaScript, TypeScript, Tailwind CSS, Next.js, Blade</w:t>
       </w:r>
@@ -177,7 +177,7 @@
           <w:b/>
           <w:i w:val="0"/>
           <w:color w:val="1F2A37"/>
-          <w:sz w:val="20"/>
+          <w:sz w:val="19"/>
         </w:rPr>
         <w:t>Mobile &amp; Alat</w:t>
       </w:r>
@@ -187,7 +187,7 @@
           <w:b w:val="0"/>
           <w:i w:val="0"/>
           <w:color w:val="1F2A37"/>
-          <w:sz w:val="20"/>
+          <w:sz w:val="19"/>
         </w:rPr>
         <w:t>: Flutter, Dio, Bluetooth thermal printer, Git, GitHub Actions (CI/CD), Docker (dasar), Postman, Linux/Windows CLI</w:t>
       </w:r>
@@ -202,7 +202,7 @@
           <w:b/>
           <w:i w:val="0"/>
           <w:color w:val="1F2A37"/>
-          <w:sz w:val="20"/>
+          <w:sz w:val="19"/>
         </w:rPr>
         <w:t>Konsep</w:t>
       </w:r>
@@ -212,14 +212,14 @@
           <w:b w:val="0"/>
           <w:i w:val="0"/>
           <w:color w:val="1F2A37"/>
-          <w:sz w:val="20"/>
+          <w:sz w:val="19"/>
         </w:rPr>
         <w:t>: MVC, desain database relasional, pengujian otomatis (PHPUnit/Pest, flutter_test, Vitest), debugging produksi, Git workflow</w:t>
       </w:r>
     </w:p>
     <w:p>
       <w:pPr>
-        <w:spacing w:before="120" w:after="40"/>
+        <w:spacing w:before="100" w:after="20"/>
         <w:pBdr>
           <w:bottom w:val="single" w:sz="6" w:space="1" w:color="B9C2CC"/>
         </w:pBdr>
@@ -230,7 +230,151 @@
           <w:b/>
           <w:i w:val="0"/>
           <w:color w:val="1F2A37"/>
-          <w:sz w:val="21"/>
+          <w:sz w:val="20"/>
+        </w:rPr>
+        <w:t>PENGALAMAN MAGANG</w:t>
+      </w:r>
+    </w:p>
+    <w:p>
+      <w:pPr>
+        <w:spacing w:before="60" w:after="0"/>
+      </w:pPr>
+      <w:r>
+        <w:rPr>
+          <w:rFonts w:ascii="Calibri" w:hAnsi="Calibri"/>
+          <w:b/>
+          <w:i w:val="0"/>
+          <w:color w:val="1F2A37"/>
+          <w:sz w:val="19"/>
+        </w:rPr>
+        <w:t>Pusdiklat BPS — Magang, Divisi Humas</w:t>
+      </w:r>
+      <w:r>
+        <w:rPr>
+          <w:rFonts w:ascii="Calibri" w:hAnsi="Calibri"/>
+          <w:b w:val="0"/>
+          <w:i w:val="0"/>
+          <w:color w:val="444C56"/>
+          <w:sz w:val="19"/>
+        </w:rPr>
+        <w:t xml:space="preserve">  |  Januari – Maret 2026</w:t>
+      </w:r>
+    </w:p>
+    <w:p>
+      <w:pPr>
+        <w:spacing w:before="0" w:after="20"/>
+      </w:pPr>
+      <w:r>
+        <w:rPr>
+          <w:rFonts w:ascii="Calibri" w:hAnsi="Calibri"/>
+          <w:b w:val="0"/>
+          <w:i/>
+          <w:color w:val="444C56"/>
+          <w:sz w:val="18"/>
+        </w:rPr>
+        <w:t>Badan Pusat Statistik (BPS) · Database Administrator · Tim Kreatif</w:t>
+      </w:r>
+    </w:p>
+    <w:p>
+      <w:pPr>
+        <w:pStyle w:val="ListBullet"/>
+        <w:spacing w:before="0" w:after="0"/>
+        <w:ind w:left="283" w:hanging="181"/>
+      </w:pPr>
+      <w:r>
+        <w:rPr>
+          <w:rFonts w:ascii="Calibri" w:hAnsi="Calibri"/>
+          <w:b w:val="0"/>
+          <w:color w:val="1F2A37"/>
+          <w:sz w:val="19"/>
+        </w:rPr>
+        <w:t xml:space="preserve">Bertugas sebagai </w:t>
+      </w:r>
+      <w:r>
+        <w:rPr>
+          <w:rFonts w:ascii="Calibri" w:hAnsi="Calibri"/>
+          <w:b/>
+          <w:color w:val="1F2A37"/>
+          <w:sz w:val="19"/>
+        </w:rPr>
+        <w:t>database administrator</w:t>
+      </w:r>
+      <w:r>
+        <w:rPr>
+          <w:rFonts w:ascii="Calibri" w:hAnsi="Calibri"/>
+          <w:b w:val="0"/>
+          <w:color w:val="1F2A37"/>
+          <w:sz w:val="19"/>
+        </w:rPr>
+        <w:t xml:space="preserve"> Divisi Humas: mengelola dan memelihara basis data internal, melakukan input dan validasi data, serta menjaga data tetap lengkap dan akurat.</w:t>
+      </w:r>
+    </w:p>
+    <w:p>
+      <w:pPr>
+        <w:pStyle w:val="ListBullet"/>
+        <w:spacing w:before="0" w:after="0"/>
+        <w:ind w:left="283" w:hanging="181"/>
+      </w:pPr>
+      <w:r>
+        <w:rPr>
+          <w:rFonts w:ascii="Calibri" w:hAnsi="Calibri"/>
+          <w:b w:val="0"/>
+          <w:color w:val="1F2A37"/>
+          <w:sz w:val="19"/>
+        </w:rPr>
+        <w:t xml:space="preserve">Menjadi bagian </w:t>
+      </w:r>
+      <w:r>
+        <w:rPr>
+          <w:rFonts w:ascii="Calibri" w:hAnsi="Calibri"/>
+          <w:b/>
+          <w:color w:val="1F2A37"/>
+          <w:sz w:val="19"/>
+        </w:rPr>
+        <w:t>tim kreatif</w:t>
+      </w:r>
+      <w:r>
+        <w:rPr>
+          <w:rFonts w:ascii="Calibri" w:hAnsi="Calibri"/>
+          <w:b w:val="0"/>
+          <w:color w:val="1F2A37"/>
+          <w:sz w:val="19"/>
+        </w:rPr>
+        <w:t xml:space="preserve"> penyusunan </w:t>
+      </w:r>
+      <w:r>
+        <w:rPr>
+          <w:rFonts w:ascii="Calibri" w:hAnsi="Calibri"/>
+          <w:b/>
+          <w:color w:val="1F2A37"/>
+          <w:sz w:val="19"/>
+        </w:rPr>
+        <w:t>memoar Kepala Pusdiklat BPS</w:t>
+      </w:r>
+      <w:r>
+        <w:rPr>
+          <w:rFonts w:ascii="Calibri" w:hAnsi="Calibri"/>
+          <w:b w:val="0"/>
+          <w:color w:val="1F2A37"/>
+          <w:sz w:val="19"/>
+        </w:rPr>
+        <w:t xml:space="preserve"> menjelang purna tugas: kurasi materi, penyusunan konten, dan dukungan dokumentasi.</w:t>
+      </w:r>
+    </w:p>
+    <w:p>
+      <w:pPr>
+        <w:spacing w:before="100" w:after="20"/>
+        <w:pBdr>
+          <w:bottom w:val="single" w:sz="6" w:space="1" w:color="B9C2CC"/>
+        </w:pBdr>
+      </w:pPr>
+      <w:r>
+        <w:rPr>
+          <w:rFonts w:ascii="Calibri" w:hAnsi="Calibri"/>
+          <w:b/>
+          <w:i w:val="0"/>
+          <w:color w:val="1F2A37"/>
+          <w:sz w:val="20"/>
         </w:rPr>
         <w:t>PENGALAMAN PROYEK</w:t>
       </w:r>
@@ -286,7 +430,7 @@
           <w:rFonts w:ascii="Calibri" w:hAnsi="Calibri"/>
           <w:b w:val="0"/>
           <w:color w:val="1F2A37"/>
-          <w:sz w:val="20"/>
+          <w:sz w:val="19"/>
         </w:rPr>
         <w:t xml:space="preserve">Merancang dan membangun </w:t>
       </w:r>
@@ -295,7 +439,7 @@
           <w:rFonts w:ascii="Calibri" w:hAnsi="Calibri"/>
           <w:b/>
           <w:color w:val="1F2A37"/>
-          <w:sz w:val="20"/>
+          <w:sz w:val="19"/>
         </w:rPr>
         <w:t>REST API Laravel</w:t>
       </w:r>
@@ -304,7 +448,7 @@
           <w:rFonts w:ascii="Calibri" w:hAnsi="Calibri"/>
           <w:b w:val="0"/>
           <w:color w:val="1F2A37"/>
-          <w:sz w:val="20"/>
+          <w:sz w:val="19"/>
         </w:rPr>
         <w:t xml:space="preserve"> sebagai satu sumber data untuk dua klien: aplikasi web dan aplikasi Android.</w:t>
       </w:r>
@@ -320,7 +464,7 @@
           <w:rFonts w:ascii="Calibri" w:hAnsi="Calibri"/>
           <w:b w:val="0"/>
           <w:color w:val="1F2A37"/>
-          <w:sz w:val="20"/>
+          <w:sz w:val="19"/>
         </w:rPr>
         <w:t xml:space="preserve">Mengembangkan modul </w:t>
       </w:r>
@@ -329,7 +473,7 @@
           <w:rFonts w:ascii="Calibri" w:hAnsi="Calibri"/>
           <w:b/>
           <w:color w:val="1F2A37"/>
-          <w:sz w:val="20"/>
+          <w:sz w:val="19"/>
         </w:rPr>
         <w:t>bon/lunas/hutang</w:t>
       </w:r>
@@ -338,7 +482,7 @@
           <w:rFonts w:ascii="Calibri" w:hAnsi="Calibri"/>
           <w:b w:val="0"/>
           <w:color w:val="1F2A37"/>
-          <w:sz w:val="20"/>
+          <w:sz w:val="19"/>
         </w:rPr>
         <w:t xml:space="preserve">, aturan promo otomatis, dan laporan penjualan per item; menerapkan </w:t>
       </w:r>
@@ -347,7 +491,7 @@
           <w:rFonts w:ascii="Calibri" w:hAnsi="Calibri"/>
           <w:b/>
           <w:color w:val="1F2A37"/>
-          <w:sz w:val="20"/>
+          <w:sz w:val="19"/>
         </w:rPr>
         <w:t>pengujian otomatis dan CI/CD</w:t>
       </w:r>
@@ -356,7 +500,7 @@
           <w:rFonts w:ascii="Calibri" w:hAnsi="Calibri"/>
           <w:b w:val="0"/>
           <w:color w:val="1F2A37"/>
-          <w:sz w:val="20"/>
+          <w:sz w:val="19"/>
         </w:rPr>
         <w:t>, dipakai harian di domain produksi.</w:t>
       </w:r>
@@ -372,7 +516,7 @@
           <w:rFonts w:ascii="Calibri" w:hAnsi="Calibri"/>
           <w:b w:val="0"/>
           <w:color w:val="1F2A37"/>
-          <w:sz w:val="20"/>
+          <w:sz w:val="19"/>
         </w:rPr>
         <w:t xml:space="preserve">Mendiagnosis gangguan server produksi (koneksi database &amp; rate limit shared hosting) dan menambah mekanisme </w:t>
       </w:r>
@@ -381,7 +525,7 @@
           <w:rFonts w:ascii="Calibri" w:hAnsi="Calibri"/>
           <w:b/>
           <w:color w:val="1F2A37"/>
-          <w:sz w:val="20"/>
+          <w:sz w:val="19"/>
         </w:rPr>
         <w:t>retry dengan backoff</w:t>
       </w:r>
@@ -390,7 +534,7 @@
           <w:rFonts w:ascii="Calibri" w:hAnsi="Calibri"/>
           <w:b w:val="0"/>
           <w:color w:val="1F2A37"/>
-          <w:sz w:val="20"/>
+          <w:sz w:val="19"/>
         </w:rPr>
         <w:t xml:space="preserve"> di sisi klien.</w:t>
       </w:r>
@@ -446,7 +590,7 @@
           <w:rFonts w:ascii="Calibri" w:hAnsi="Calibri"/>
           <w:b w:val="0"/>
           <w:color w:val="1F2A37"/>
-          <w:sz w:val="20"/>
+          <w:sz w:val="19"/>
         </w:rPr>
         <w:t xml:space="preserve">Mengintegrasikan </w:t>
       </w:r>
@@ -455,7 +599,7 @@
           <w:rFonts w:ascii="Calibri" w:hAnsi="Calibri"/>
           <w:b/>
           <w:color w:val="1F2A37"/>
-          <w:sz w:val="20"/>
+          <w:sz w:val="19"/>
         </w:rPr>
         <w:t>payment gateway Midtrans Snap</w:t>
       </w:r>
@@ -464,7 +608,7 @@
           <w:rFonts w:ascii="Calibri" w:hAnsi="Calibri"/>
           <w:b w:val="0"/>
           <w:color w:val="1F2A37"/>
-          <w:sz w:val="20"/>
+          <w:sz w:val="19"/>
         </w:rPr>
         <w:t xml:space="preserve"> untuk pembayaran tebus &amp; perpanjang gadai: create/resume/reprocess/cancel, generate Snap token, dan </w:t>
       </w:r>
@@ -473,7 +617,7 @@
           <w:rFonts w:ascii="Calibri" w:hAnsi="Calibri"/>
           <w:b/>
           <w:color w:val="1F2A37"/>
-          <w:sz w:val="20"/>
+          <w:sz w:val="19"/>
         </w:rPr>
         <w:t>handler notifikasi webhook</w:t>
       </w:r>
@@ -482,7 +626,7 @@
           <w:rFonts w:ascii="Calibri" w:hAnsi="Calibri"/>
           <w:b w:val="0"/>
           <w:color w:val="1F2A37"/>
-          <w:sz w:val="20"/>
+          <w:sz w:val="19"/>
         </w:rPr>
         <w:t xml:space="preserve"> sinkronisasi status transaksi (sandbox).</w:t>
       </w:r>
@@ -498,7 +642,7 @@
           <w:rFonts w:ascii="Calibri" w:hAnsi="Calibri"/>
           <w:b w:val="0"/>
           <w:color w:val="1F2A37"/>
-          <w:sz w:val="20"/>
+          <w:sz w:val="19"/>
         </w:rPr>
         <w:t xml:space="preserve">Membangun </w:t>
       </w:r>
@@ -507,7 +651,7 @@
           <w:rFonts w:ascii="Calibri" w:hAnsi="Calibri"/>
           <w:b/>
           <w:color w:val="1F2A37"/>
-          <w:sz w:val="20"/>
+          <w:sz w:val="19"/>
         </w:rPr>
         <w:t>backend alur bisnis pegadaian</w:t>
       </w:r>
@@ -516,7 +660,7 @@
           <w:rFonts w:ascii="Calibri" w:hAnsi="Calibri"/>
           <w:b w:val="0"/>
           <w:color w:val="1F2A37"/>
-          <w:sz w:val="20"/>
+          <w:sz w:val="19"/>
         </w:rPr>
         <w:t xml:space="preserve">: tebus, perpanjang, lelang, penaksiran harga, bunga tenor, saldo cabang, transaksi multi-cabang — Eloquent + </w:t>
       </w:r>
@@ -525,7 +669,7 @@
           <w:rFonts w:ascii="Calibri" w:hAnsi="Calibri"/>
           <w:b/>
           <w:color w:val="1F2A37"/>
-          <w:sz w:val="20"/>
+          <w:sz w:val="19"/>
         </w:rPr>
         <w:t>29 migration</w:t>
       </w:r>
@@ -534,7 +678,7 @@
           <w:rFonts w:ascii="Calibri" w:hAnsi="Calibri"/>
           <w:b w:val="0"/>
           <w:color w:val="1F2A37"/>
-          <w:sz w:val="20"/>
+          <w:sz w:val="19"/>
         </w:rPr>
         <w:t>, multi-role (superadmin/admin/staff/nasabah).</w:t>
       </w:r>
@@ -550,16 +694,16 @@
           <w:rFonts w:ascii="Calibri" w:hAnsi="Calibri"/>
           <w:b w:val="0"/>
           <w:color w:val="1F2A37"/>
-          <w:sz w:val="20"/>
+          <w:sz w:val="19"/>
         </w:rPr>
-        <w:t xml:space="preserve">Menjaga integritas transaksi: cegah pembayaran ganda &amp; tebus barang berstatus ditebus, mekanisme state </w:t>
+        <w:t xml:space="preserve">Menjaga integritas transaksi: cegah pembayaran ganda &amp; tebus barang berstatus ditebus; state </w:t>
       </w:r>
       <w:r>
         <w:rPr>
           <w:rFonts w:ascii="Calibri" w:hAnsi="Calibri"/>
           <w:b/>
           <w:color w:val="1F2A37"/>
-          <w:sz w:val="20"/>
+          <w:sz w:val="19"/>
         </w:rPr>
         <w:t>pending payment</w:t>
       </w:r>
@@ -568,9 +712,9 @@
           <w:rFonts w:ascii="Calibri" w:hAnsi="Calibri"/>
           <w:b w:val="0"/>
           <w:color w:val="1F2A37"/>
-          <w:sz w:val="20"/>
+          <w:sz w:val="19"/>
         </w:rPr>
-        <w:t xml:space="preserve"> beserta resume/reprocess; konfigurasi server/client key via .env, 3DS.</w:t>
+        <w:t xml:space="preserve"> beserta resume/reprocess; server/client key via .env, 3DS.</w:t>
       </w:r>
     </w:p>
     <w:p>
@@ -624,7 +768,7 @@
           <w:rFonts w:ascii="Calibri" w:hAnsi="Calibri"/>
           <w:b w:val="0"/>
           <w:color w:val="1F2A37"/>
-          <w:sz w:val="20"/>
+          <w:sz w:val="19"/>
         </w:rPr>
         <w:t xml:space="preserve">Membangun </w:t>
       </w:r>
@@ -633,7 +777,7 @@
           <w:rFonts w:ascii="Calibri" w:hAnsi="Calibri"/>
           <w:b/>
           <w:color w:val="1F2A37"/>
-          <w:sz w:val="20"/>
+          <w:sz w:val="19"/>
         </w:rPr>
         <w:t>editor desain kanvas multi-zona</w:t>
       </w:r>
@@ -642,7 +786,7 @@
           <w:rFonts w:ascii="Calibri" w:hAnsi="Calibri"/>
           <w:b w:val="0"/>
           <w:color w:val="1F2A37"/>
-          <w:sz w:val="20"/>
+          <w:sz w:val="19"/>
         </w:rPr>
         <w:t xml:space="preserve"> (Fabric.js) yang mengubah desain sablon menjadi pesanan tanpa komunikasi bolak-balik; alur order dengan verifikasi admin.</w:t>
       </w:r>
@@ -658,7 +802,7 @@
           <w:rFonts w:ascii="Calibri" w:hAnsi="Calibri"/>
           <w:b w:val="0"/>
           <w:color w:val="1F2A37"/>
-          <w:sz w:val="20"/>
+          <w:sz w:val="19"/>
         </w:rPr>
         <w:t xml:space="preserve">Menulis </w:t>
       </w:r>
@@ -667,7 +811,7 @@
           <w:rFonts w:ascii="Calibri" w:hAnsi="Calibri"/>
           <w:b/>
           <w:color w:val="1F2A37"/>
-          <w:sz w:val="20"/>
+          <w:sz w:val="19"/>
         </w:rPr>
         <w:t>46 test (11 file)</w:t>
       </w:r>
@@ -676,7 +820,7 @@
           <w:rFonts w:ascii="Calibri" w:hAnsi="Calibri"/>
           <w:b w:val="0"/>
           <w:color w:val="1F2A37"/>
-          <w:sz w:val="20"/>
+          <w:sz w:val="19"/>
         </w:rPr>
         <w:t xml:space="preserve"> yang berjalan otomatis di CI terhadap MySQL.</w:t>
       </w:r>
@@ -732,7 +876,7 @@
           <w:rFonts w:ascii="Calibri" w:hAnsi="Calibri"/>
           <w:b w:val="0"/>
           <w:color w:val="1F2A37"/>
-          <w:sz w:val="20"/>
+          <w:sz w:val="19"/>
         </w:rPr>
         <w:t xml:space="preserve">Membangun CLI yang mendeteksi stack proyek, menjalankan build/test/release di balik gerbang </w:t>
       </w:r>
@@ -741,7 +885,7 @@
           <w:rFonts w:ascii="Calibri" w:hAnsi="Calibri"/>
           <w:b/>
           <w:color w:val="1F2A37"/>
-          <w:sz w:val="20"/>
+          <w:sz w:val="19"/>
         </w:rPr>
         <w:t>SAFE/REVIEW/DANGEROUS</w:t>
       </w:r>
@@ -750,7 +894,7 @@
           <w:rFonts w:ascii="Calibri" w:hAnsi="Calibri"/>
           <w:b w:val="0"/>
           <w:color w:val="1F2A37"/>
-          <w:sz w:val="20"/>
+          <w:sz w:val="19"/>
         </w:rPr>
         <w:t>, dan menolak melaporkan sukses tanpa bukti.</w:t>
       </w:r>
@@ -766,7 +910,7 @@
           <w:rFonts w:ascii="Calibri" w:hAnsi="Calibri"/>
           <w:b w:val="0"/>
           <w:color w:val="1F2A37"/>
-          <w:sz w:val="20"/>
+          <w:sz w:val="19"/>
         </w:rPr>
         <w:t xml:space="preserve">Menulis </w:t>
       </w:r>
@@ -775,7 +919,7 @@
           <w:rFonts w:ascii="Calibri" w:hAnsi="Calibri"/>
           <w:b/>
           <w:color w:val="1F2A37"/>
-          <w:sz w:val="20"/>
+          <w:sz w:val="19"/>
         </w:rPr>
         <w:t>198 test otomatis</w:t>
       </w:r>
@@ -784,7 +928,7 @@
           <w:rFonts w:ascii="Calibri" w:hAnsi="Calibri"/>
           <w:b w:val="0"/>
           <w:color w:val="1F2A37"/>
-          <w:sz w:val="20"/>
+          <w:sz w:val="19"/>
         </w:rPr>
         <w:t xml:space="preserve"> dengan audit trail append-only; dirilis hingga v0.7.5.</w:t>
       </w:r>
@@ -840,7 +984,7 @@
           <w:rFonts w:ascii="Calibri" w:hAnsi="Calibri"/>
           <w:b w:val="0"/>
           <w:color w:val="1F2A37"/>
-          <w:sz w:val="20"/>
+          <w:sz w:val="19"/>
         </w:rPr>
         <w:t xml:space="preserve">Dibangun dari nol; skor </w:t>
       </w:r>
@@ -849,7 +993,7 @@
           <w:rFonts w:ascii="Calibri" w:hAnsi="Calibri"/>
           <w:b/>
           <w:color w:val="1F2A37"/>
-          <w:sz w:val="20"/>
+          <w:sz w:val="19"/>
         </w:rPr>
         <w:t>Lighthouse 100/100/100</w:t>
       </w:r>
@@ -858,14 +1002,14 @@
           <w:rFonts w:ascii="Calibri" w:hAnsi="Calibri"/>
           <w:b w:val="0"/>
           <w:color w:val="1F2A37"/>
-          <w:sz w:val="20"/>
+          <w:sz w:val="19"/>
         </w:rPr>
         <w:t xml:space="preserve"> desktop; setiap klaim proyek ditautkan ke repositori &amp; artefak yang dapat diverifikasi.</w:t>
       </w:r>
     </w:p>
     <w:p>
       <w:pPr>
-        <w:spacing w:before="120" w:after="40"/>
+        <w:spacing w:before="100" w:after="20"/>
         <w:pBdr>
           <w:bottom w:val="single" w:sz="6" w:space="1" w:color="B9C2CC"/>
         </w:pBdr>
@@ -876,7 +1020,7 @@
           <w:b/>
           <w:i w:val="0"/>
           <w:color w:val="1F2A37"/>
-          <w:sz w:val="21"/>
+          <w:sz w:val="20"/>
         </w:rPr>
         <w:t>PENDIDIKAN</w:t>
       </w:r>
@@ -891,7 +1035,7 @@
           <w:b/>
           <w:i w:val="0"/>
           <w:color w:val="1F2A37"/>
-          <w:sz w:val="20"/>
+          <w:sz w:val="19"/>
         </w:rPr>
         <w:t>S1 Teknik Informatika — Universitas Pamulang</w:t>
       </w:r>
@@ -901,7 +1045,7 @@
           <w:b w:val="0"/>
           <w:i w:val="0"/>
           <w:color w:val="444C56"/>
-          <w:sz w:val="20"/>
+          <w:sz w:val="19"/>
         </w:rPr>
         <w:t xml:space="preserve">  |  2022 – 2026  |  IPK 3,56 / 4,00</w:t>
       </w:r>
@@ -917,14 +1061,14 @@
           <w:rFonts w:ascii="Calibri" w:hAnsi="Calibri"/>
           <w:b w:val="0"/>
           <w:color w:val="1F2A37"/>
-          <w:sz w:val="20"/>
+          <w:sz w:val="19"/>
         </w:rPr>
         <w:t>Skripsi: sistem pemesanan sablon berbasis web dengan editor desain kanvas (Laravel, Livewire, Fabric.js).</w:t>
       </w:r>
     </w:p>
     <w:sectPr>
       <w:pgSz w:w="12240" w:h="15840"/>
-      <w:pgMar w:top="624" w:right="850" w:bottom="567" w:left="850" w:header="720" w:footer="720" w:gutter="0"/>
+      <w:pgMar w:top="510" w:right="794" w:bottom="454" w:left="794" w:header="720" w:footer="720" w:gutter="0"/>
       <w:cols w:space="720"/>
       <w:docGrid w:linePitch="360"/>
     </w:sectPr>
@@ -1300,7 +1444,7 @@
     </w:pPr>
     <w:rPr>
       <w:rFonts w:ascii="Calibri" w:hAnsi="Calibri" w:eastAsia="Calibri"/>
-      <w:sz w:val="20"/>
+      <w:sz w:val="19"/>
     </w:rPr>
   </w:style>
   <w:style w:type="paragraph" w:styleId="Header">

</xml_diff>